<commit_message>
FTO: wycofanie niezweryfikowanych ustalen o patentach, teksty oparte na opisach z wniosku, tabela do sprawdzenia
Co-Authored-By: Claude Sonnet 5.5 <noreply@anthropic.com>
Claude-Session: https://claude.ai/code/session_01672WnJhixnEcarbb7uiwfx
</commit_message>
<xml_diff>
--- a/Sekcja_2.2_i_2.5_prawa_FTO_zasoby.docx
+++ b/Sekcja_2.2_i_2.5_prawa_FTO_zasoby.docx
@@ -158,7 +158,7 @@
                 <w:b w:val="0"/>
                 <w:sz w:val="18"/>
               </w:rPr>
-              <w:t>Ocena dotyczy kombinacji funkcji, a nie elementów. Wszystkie patenty z USA, bez statusu i terytoriów. Brak patentów UPS na pomiar wykorzystania naczepy kamerą głębi (EP 3103072 wskazuje Polskę) i BlackBerry na światło strukturalne.</w:t>
+              <w:t>Ocena dotyczy kombinacji funkcji, a nie elementów; brak statusu prawnego i terytoriów patentów.</w:t>
             </w:r>
           </w:p>
         </w:tc>
@@ -173,7 +173,7 @@
                 <w:b w:val="0"/>
                 <w:sz w:val="18"/>
               </w:rPr>
-              <w:t>Ocena osobno dla czterech elementów, status i terytorium każdego patentu, nowe patenty, jawna informacja, co zostało do sprawdzenia przez rzecznika.</w:t>
+              <w:t>Ocena osobno dla czterech elementów, z miejscami na status prawny i terytorium każdego patentu oraz na wynik sprawdzenia rodzin EP i PL. Opisy patentów pozostają takie jak we wniosku (sprawdzone przez Everest11).</w:t>
             </w:r>
           </w:p>
         </w:tc>
@@ -205,7 +205,7 @@
                 <w:b w:val="0"/>
                 <w:sz w:val="18"/>
               </w:rPr>
-              <w:t>Zbyt ogólne zdania. Błędne opisy patentów: US 11,685,400 B2 ma właściciela Autobrains, a nie Mobileye; US 10,158,842 B2 (Honeywell) to czujniki 3D ze światłem strukturalnym w kontenerze, a nie systemy przy bramach, i wygasł.</w:t>
+              <w:t>Zbyt ogólne zdania, brak konkretnych publikacji.</w:t>
             </w:r>
           </w:p>
         </w:tc>
@@ -220,7 +220,7 @@
                 <w:b w:val="0"/>
                 <w:sz w:val="18"/>
               </w:rPr>
-              <w:t>Konkretne dokumenty z różnicami względem CargoDT i konkretne publikacje (z DOI) dla każdego elementu.</w:t>
+              <w:t>Podział na elementy systemu, różnice względem CargoDT dla każdego patentu i konkretne publikacje z DOI. Dodatkowe dokumenty, które wskazała wyszukiwarka, są w części 2 jako niezweryfikowane i nie weszły do tekstu.</w:t>
             </w:r>
           </w:p>
         </w:tc>
@@ -373,7 +373,7 @@
         <w:pStyle w:val="Heading1"/>
       </w:pPr>
       <w:r>
-        <w:t>2. Patenty i publikacje (stan z baz, 02.10.2026)</w:t>
+        <w:t>2. Dokumenty wskazane przez wyszukiwarkę: do sprawdzenia, niezweryfikowane</w:t>
       </w:r>
     </w:p>
     <w:p>
@@ -384,7 +384,7 @@
         <w:rPr>
           <w:b w:val="0"/>
         </w:rPr>
-        <w:t>Dane o właścicielach i statusie pochodzą z wyszukiwarki baz patentowych (Google Patents i USPTO). Zastrzeżeń większości patentów nie analizowano, więc kolumna „Ryzyko” to ocena wstępna. Przed wpisaniem do wniosku trzeba sprawdzić status prawny i rodziny patentowe w Espacenet oraz zlecić ocenę zastrzeżeń rzecznikowi patentowemu. Nowy koszt na ten cel nie może zwiększyć budżetu projektu, więc ocena rzecznika powinna być sfinansowana ze środków własnych Everest11 albo w ramach pozycji patentowej w Z11, jeśli pozwala na to jej zakres.</w:t>
+        <w:t>Uwaga. Z tego środowiska nie ma dostępu do baz patentowych (Google Patents, Espacenet, USPTO), a wyszukiwarka internetowa dała o tym samym patencie sprzeczne dane (np. właściciel US 11,151,506 B2). Dlatego poniższa tabela nie jest ustaleniem faktów. Teksty w części 3 opierają się na opisach patentów z obecnego wniosku, które Everest11 już sprawdził. Tabela wskazuje, co warto potwierdzić w Espacenet lub Google Patents (adresy w ostatniej kolumnie), zanim cokolwiek zostanie dopisane lub zmienione we wniosku.</w:t>
       </w:r>
     </w:p>
     <w:tbl>
@@ -394,17 +394,15 @@
         <w:tblLook w:firstColumn="1" w:firstRow="1" w:lastColumn="0" w:lastRow="0" w:noHBand="0" w:noVBand="1" w:val="04A0"/>
       </w:tblPr>
       <w:tblGrid>
-        <w:gridCol w:w="1606"/>
-        <w:gridCol w:w="1606"/>
-        <w:gridCol w:w="1606"/>
-        <w:gridCol w:w="1606"/>
-        <w:gridCol w:w="1606"/>
-        <w:gridCol w:w="1606"/>
+        <w:gridCol w:w="2409"/>
+        <w:gridCol w:w="2409"/>
+        <w:gridCol w:w="2409"/>
+        <w:gridCol w:w="2409"/>
       </w:tblGrid>
       <w:tr>
         <w:tc>
           <w:tcPr>
-            <w:tcW w:type="dxa" w:w="1474"/>
+            <w:tcW w:type="dxa" w:w="1587"/>
           </w:tcPr>
           <w:p>
             <w:r/>
@@ -419,7 +417,7 @@
         </w:tc>
         <w:tc>
           <w:tcPr>
-            <w:tcW w:type="dxa" w:w="2041"/>
+            <w:tcW w:type="dxa" w:w="3515"/>
           </w:tcPr>
           <w:p>
             <w:r/>
@@ -428,13 +426,13 @@
                 <w:b/>
                 <w:sz w:val="18"/>
               </w:rPr>
-              <w:t>Przedmiot</w:t>
+              <w:t>We wniosku i według wyszukiwarki</w:t>
             </w:r>
           </w:p>
         </w:tc>
         <w:tc>
           <w:tcPr>
-            <w:tcW w:type="dxa" w:w="1361"/>
+            <w:tcW w:type="dxa" w:w="2835"/>
           </w:tcPr>
           <w:p>
             <w:r/>
@@ -443,13 +441,13 @@
                 <w:b/>
                 <w:sz w:val="18"/>
               </w:rPr>
-              <w:t>Status</w:t>
+              <w:t>Co sprawdzić</w:t>
             </w:r>
           </w:p>
         </w:tc>
         <w:tc>
           <w:tcPr>
-            <w:tcW w:type="dxa" w:w="1134"/>
+            <w:tcW w:type="dxa" w:w="1814"/>
           </w:tcPr>
           <w:p>
             <w:r/>
@@ -458,37 +456,7 @@
                 <w:b/>
                 <w:sz w:val="18"/>
               </w:rPr>
-              <w:t>Terytorium</w:t>
-            </w:r>
-          </w:p>
-        </w:tc>
-        <w:tc>
-          <w:tcPr>
-            <w:tcW w:type="dxa" w:w="1474"/>
-          </w:tcPr>
-          <w:p>
-            <w:r/>
-            <w:r>
-              <w:rPr>
-                <w:b/>
-                <w:sz w:val="18"/>
-              </w:rPr>
-              <w:t>Ryzyko</w:t>
-            </w:r>
-          </w:p>
-        </w:tc>
-        <w:tc>
-          <w:tcPr>
-            <w:tcW w:type="dxa" w:w="2381"/>
-          </w:tcPr>
-          <w:p>
-            <w:r/>
-            <w:r>
-              <w:rPr>
-                <w:b/>
-                <w:sz w:val="18"/>
-              </w:rPr>
-              <w:t>Uwaga</w:t>
+              <w:t>Adres</w:t>
             </w:r>
           </w:p>
         </w:tc>
@@ -496,7 +464,7 @@
       <w:tr>
         <w:tc>
           <w:tcPr>
-            <w:tcW w:type="dxa" w:w="1474"/>
+            <w:tcW w:type="dxa" w:w="1587"/>
           </w:tcPr>
           <w:p>
             <w:r/>
@@ -511,7 +479,7 @@
         </w:tc>
         <w:tc>
           <w:tcPr>
-            <w:tcW w:type="dxa" w:w="2041"/>
+            <w:tcW w:type="dxa" w:w="3515"/>
           </w:tcPr>
           <w:p>
             <w:r/>
@@ -520,13 +488,13 @@
                 <w:b w:val="0"/>
                 <w:sz w:val="18"/>
               </w:rPr>
-              <w:t>Mapa 3D wnętrza kontenera z czujników LiDAR, pojemność, chmura, monitorowanie zmian wg trasy i harmonogramu</w:t>
+              <w:t>We wniosku: Amazon Technologies, LiDAR i wideo w stacjonarnym kontenerze. Wyszukiwarka podała raz innych wynalazców i raz LG Electronics, a w zastrzeżeniach: LiDAR w kontenerze, mapa 3D, pojemność, chmura, monitorowanie zmian wg trasy.</w:t>
             </w:r>
           </w:p>
         </w:tc>
         <w:tc>
           <w:tcPr>
-            <w:tcW w:type="dxa" w:w="1361"/>
+            <w:tcW w:type="dxa" w:w="2835"/>
           </w:tcPr>
           <w:p>
             <w:r/>
@@ -535,13 +503,13 @@
                 <w:b w:val="0"/>
                 <w:sz w:val="18"/>
               </w:rPr>
-              <w:t>w mocy (Google Patents); właściciel do potwierdzenia</w:t>
+              <w:t>Właściciel, status, rodzina EP/PL, a przede wszystkim czy opis „stacjonarny kontener” jest zgodny z zastrzeżeniami (wyszukiwarka sugeruje przewóz wg trasy i harmonogramu).</w:t>
             </w:r>
           </w:p>
         </w:tc>
         <w:tc>
           <w:tcPr>
-            <w:tcW w:type="dxa" w:w="1134"/>
+            <w:tcW w:type="dxa" w:w="1814"/>
           </w:tcPr>
           <w:p>
             <w:r/>
@@ -550,13 +518,15 @@
                 <w:b w:val="0"/>
                 <w:sz w:val="18"/>
               </w:rPr>
-              <w:t>US; rodzina EP/PL do sprawdzenia</w:t>
+              <w:t>https://patents.google.com/patent/US11151506B2/en</w:t>
             </w:r>
           </w:p>
         </w:tc>
+      </w:tr>
+      <w:tr>
         <w:tc>
           <w:tcPr>
-            <w:tcW w:type="dxa" w:w="1474"/>
+            <w:tcW w:type="dxa" w:w="1587"/>
           </w:tcPr>
           <w:p>
             <w:r/>
@@ -565,13 +535,13 @@
                 <w:b w:val="0"/>
                 <w:sz w:val="18"/>
               </w:rPr>
-              <w:t>Wysoka: najbliższy; kluczowe, czy „LiDAR” obejmuje kamery ToF</w:t>
+              <w:t>US 11,685,400 B2</w:t>
             </w:r>
           </w:p>
         </w:tc>
         <w:tc>
           <w:tcPr>
-            <w:tcW w:type="dxa" w:w="2381"/>
+            <w:tcW w:type="dxa" w:w="3515"/>
           </w:tcPr>
           <w:p>
             <w:r/>
@@ -580,15 +550,13 @@
                 <w:b w:val="0"/>
                 <w:sz w:val="18"/>
               </w:rPr>
-              <w:t>Różnice: kamery ToF i światło strukturalne, położenie ładunku w ruchu, lokalnie bez chmury. Ocena rzecznika.</w:t>
+              <w:t>We wniosku: Mobileye/Intel. Wyszukiwarka wskazała Autobrains, następnie Cartica AI.</w:t>
             </w:r>
           </w:p>
         </w:tc>
-      </w:tr>
-      <w:tr>
         <w:tc>
           <w:tcPr>
-            <w:tcW w:type="dxa" w:w="1474"/>
+            <w:tcW w:type="dxa" w:w="2835"/>
           </w:tcPr>
           <w:p>
             <w:r/>
@@ -597,13 +565,13 @@
                 <w:b w:val="0"/>
                 <w:sz w:val="18"/>
               </w:rPr>
-              <w:t>US 10,769,576 B2 (BlackBerry)</w:t>
+              <w:t>Właściciel pierwotny i obecny oraz zakres zastrzeżeń (klasa ładunku, sposób zamocowania).</w:t>
             </w:r>
           </w:p>
         </w:tc>
         <w:tc>
           <w:tcPr>
-            <w:tcW w:type="dxa" w:w="2041"/>
+            <w:tcW w:type="dxa" w:w="1814"/>
           </w:tcPr>
           <w:p>
             <w:r/>
@@ -612,13 +580,15 @@
                 <w:b w:val="0"/>
                 <w:sz w:val="18"/>
               </w:rPr>
-              <w:t>Rzutowanie siatki punktów i analiza obrazu do oceny załadunku kontenera</w:t>
+              <w:t>https://patents.google.com/patent/US11685400B2/en</w:t>
             </w:r>
           </w:p>
         </w:tc>
+      </w:tr>
+      <w:tr>
         <w:tc>
           <w:tcPr>
-            <w:tcW w:type="dxa" w:w="1361"/>
+            <w:tcW w:type="dxa" w:w="1587"/>
           </w:tcPr>
           <w:p>
             <w:r/>
@@ -627,13 +597,13 @@
                 <w:b w:val="0"/>
                 <w:sz w:val="18"/>
               </w:rPr>
-              <w:t>w mocy</w:t>
+              <w:t>US 2013/0342653 A1 i US 10,158,842 B2</w:t>
             </w:r>
           </w:p>
         </w:tc>
         <w:tc>
           <w:tcPr>
-            <w:tcW w:type="dxa" w:w="1134"/>
+            <w:tcW w:type="dxa" w:w="3515"/>
           </w:tcPr>
           <w:p>
             <w:r/>
@@ -642,13 +612,13 @@
                 <w:b w:val="0"/>
                 <w:sz w:val="18"/>
               </w:rPr>
-              <w:t>US; rodzina do sprawdzenia</w:t>
+              <w:t>We wniosku: Honeywell, systemy przy bramach z czujnikami IR i ultradźwiękowymi. Wyszukiwarka opisała: aktywne czujniki 3D ze światłem strukturalnym w kontenerze, patent wygasły (brak opłat).</w:t>
             </w:r>
           </w:p>
         </w:tc>
         <w:tc>
           <w:tcPr>
-            <w:tcW w:type="dxa" w:w="1474"/>
+            <w:tcW w:type="dxa" w:w="2835"/>
           </w:tcPr>
           <w:p>
             <w:r/>
@@ -657,13 +627,13 @@
                 <w:b w:val="0"/>
                 <w:sz w:val="18"/>
               </w:rPr>
-              <w:t>Średnia: światło strukturalne</w:t>
+              <w:t>Treść zastrzeżeń i status. Jeśli czujniki 3D ze światłem strukturalnym w kontenerze są potwierdzone, opis we wniosku wymaga zmiany.</w:t>
             </w:r>
           </w:p>
         </w:tc>
         <w:tc>
           <w:tcPr>
-            <w:tcW w:type="dxa" w:w="2381"/>
+            <w:tcW w:type="dxa" w:w="1814"/>
           </w:tcPr>
           <w:p>
             <w:r/>
@@ -672,7 +642,7 @@
                 <w:b w:val="0"/>
                 <w:sz w:val="18"/>
               </w:rPr>
-              <w:t>Różnice: wiele kamer i radar, położenie i przemieszczenie ładunku, nie zajętość.</w:t>
+              <w:t>https://patents.google.com/patent/US20130342653A1/en</w:t>
             </w:r>
           </w:p>
         </w:tc>
@@ -680,191 +650,7 @@
       <w:tr>
         <w:tc>
           <w:tcPr>
-            <w:tcW w:type="dxa" w:w="1474"/>
-          </w:tcPr>
-          <w:p>
-            <w:r/>
-            <w:r>
-              <w:rPr>
-                <w:b w:val="0"/>
-                <w:sz w:val="18"/>
-              </w:rPr>
-              <w:t>US 10,158,842 B2 (Honeywell) i US 2013/0342653 A1</w:t>
-            </w:r>
-          </w:p>
-        </w:tc>
-        <w:tc>
-          <w:tcPr>
-            <w:tcW w:type="dxa" w:w="2041"/>
-          </w:tcPr>
-          <w:p>
-            <w:r/>
-            <w:r>
-              <w:rPr>
-                <w:b w:val="0"/>
-                <w:sz w:val="18"/>
-              </w:rPr>
-              <w:t>Aktywne czujniki 3D na podczerwień ze światłem strukturalnym w kontenerze</w:t>
-            </w:r>
-          </w:p>
-        </w:tc>
-        <w:tc>
-          <w:tcPr>
-            <w:tcW w:type="dxa" w:w="1361"/>
-          </w:tcPr>
-          <w:p>
-            <w:r/>
-            <w:r>
-              <w:rPr>
-                <w:b w:val="0"/>
-                <w:sz w:val="18"/>
-              </w:rPr>
-              <w:t>wygasły (brak opłat)</w:t>
-            </w:r>
-          </w:p>
-        </w:tc>
-        <w:tc>
-          <w:tcPr>
-            <w:tcW w:type="dxa" w:w="1134"/>
-          </w:tcPr>
-          <w:p>
-            <w:r/>
-            <w:r>
-              <w:rPr>
-                <w:b w:val="0"/>
-                <w:sz w:val="18"/>
-              </w:rPr>
-              <w:t>US</w:t>
-            </w:r>
-          </w:p>
-        </w:tc>
-        <w:tc>
-          <w:tcPr>
-            <w:tcW w:type="dxa" w:w="1474"/>
-          </w:tcPr>
-          <w:p>
-            <w:r/>
-            <w:r>
-              <w:rPr>
-                <w:b w:val="0"/>
-                <w:sz w:val="18"/>
-              </w:rPr>
-              <w:t>Niska jako bariera; wysoka jako stan techniki</w:t>
-            </w:r>
-          </w:p>
-        </w:tc>
-        <w:tc>
-          <w:tcPr>
-            <w:tcW w:type="dxa" w:w="2381"/>
-          </w:tcPr>
-          <w:p>
-            <w:r/>
-            <w:r>
-              <w:rPr>
-                <w:b w:val="0"/>
-                <w:sz w:val="18"/>
-              </w:rPr>
-              <w:t>W obecnym wniosku opisany błędnie jako stacjonarny system przy bramach. Poprawić.</w:t>
-            </w:r>
-          </w:p>
-        </w:tc>
-      </w:tr>
-      <w:tr>
-        <w:tc>
-          <w:tcPr>
-            <w:tcW w:type="dxa" w:w="1474"/>
-          </w:tcPr>
-          <w:p>
-            <w:r/>
-            <w:r>
-              <w:rPr>
-                <w:b w:val="0"/>
-                <w:sz w:val="18"/>
-              </w:rPr>
-              <w:t>EP 3103072, US 12,198,091 B2, US 11,763,439 B2, US 12,086,934 B2 (UPS)</w:t>
-            </w:r>
-          </w:p>
-        </w:tc>
-        <w:tc>
-          <w:tcPr>
-            <w:tcW w:type="dxa" w:w="2041"/>
-          </w:tcPr>
-          <w:p>
-            <w:r/>
-            <w:r>
-              <w:rPr>
-                <w:b w:val="0"/>
-                <w:sz w:val="18"/>
-              </w:rPr>
-              <w:t>Kamera głębi mierzy wykorzystanie naczepy w czasie załadunku (stosunek objętości paczek do załadowanej)</w:t>
-            </w:r>
-          </w:p>
-        </w:tc>
-        <w:tc>
-          <w:tcPr>
-            <w:tcW w:type="dxa" w:w="1361"/>
-          </w:tcPr>
-          <w:p>
-            <w:r/>
-            <w:r>
-              <w:rPr>
-                <w:b w:val="0"/>
-                <w:sz w:val="18"/>
-              </w:rPr>
-              <w:t>EP: wskazuje PL wśród państw, status i walidacja do sprawdzenia; US w mocy</w:t>
-            </w:r>
-          </w:p>
-        </w:tc>
-        <w:tc>
-          <w:tcPr>
-            <w:tcW w:type="dxa" w:w="1134"/>
-          </w:tcPr>
-          <w:p>
-            <w:r/>
-            <w:r>
-              <w:rPr>
-                <w:b w:val="0"/>
-                <w:sz w:val="18"/>
-              </w:rPr>
-              <w:t>EP (w tym PL), US</w:t>
-            </w:r>
-          </w:p>
-        </w:tc>
-        <w:tc>
-          <w:tcPr>
-            <w:tcW w:type="dxa" w:w="1474"/>
-          </w:tcPr>
-          <w:p>
-            <w:r/>
-            <w:r>
-              <w:rPr>
-                <w:b w:val="0"/>
-                <w:sz w:val="18"/>
-              </w:rPr>
-              <w:t>Wysoka: faza załadunku</w:t>
-            </w:r>
-          </w:p>
-        </w:tc>
-        <w:tc>
-          <w:tcPr>
-            <w:tcW w:type="dxa" w:w="2381"/>
-          </w:tcPr>
-          <w:p>
-            <w:r/>
-            <w:r>
-              <w:rPr>
-                <w:b w:val="0"/>
-                <w:sz w:val="18"/>
-              </w:rPr>
-              <w:t>CargoDT nie liczy wykorzystania z objętości paczek. Sprawdzić status EP i walidację w PL.</w:t>
-            </w:r>
-          </w:p>
-        </w:tc>
-      </w:tr>
-      <w:tr>
-        <w:tc>
-          <w:tcPr>
-            <w:tcW w:type="dxa" w:w="1474"/>
+            <w:tcW w:type="dxa" w:w="1587"/>
           </w:tcPr>
           <w:p>
             <w:r/>
@@ -879,7 +665,7 @@
         </w:tc>
         <w:tc>
           <w:tcPr>
-            <w:tcW w:type="dxa" w:w="2041"/>
+            <w:tcW w:type="dxa" w:w="3515"/>
           </w:tcPr>
           <w:p>
             <w:r/>
@@ -888,13 +674,13 @@
                 <w:b w:val="0"/>
                 <w:sz w:val="18"/>
               </w:rPr>
-              <w:t>Urządzenie wykrywające ładunek w kontenerze</w:t>
+              <w:t>We wniosku: stacjonarne systemy przy bramach. Wyszukiwarka podała tytuł „Cargo sensing apparatus for a cargo container”.</w:t>
             </w:r>
           </w:p>
         </w:tc>
         <w:tc>
           <w:tcPr>
-            <w:tcW w:type="dxa" w:w="1361"/>
+            <w:tcW w:type="dxa" w:w="2835"/>
           </w:tcPr>
           <w:p>
             <w:r/>
@@ -903,13 +689,13 @@
                 <w:b w:val="0"/>
                 <w:sz w:val="18"/>
               </w:rPr>
-              <w:t>do sprawdzenia</w:t>
+              <w:t>Właściciel, treść i status.</w:t>
             </w:r>
           </w:p>
         </w:tc>
         <w:tc>
           <w:tcPr>
-            <w:tcW w:type="dxa" w:w="1134"/>
+            <w:tcW w:type="dxa" w:w="1814"/>
           </w:tcPr>
           <w:p>
             <w:r/>
@@ -918,37 +704,7 @@
                 <w:b w:val="0"/>
                 <w:sz w:val="18"/>
               </w:rPr>
-              <w:t>US</w:t>
-            </w:r>
-          </w:p>
-        </w:tc>
-        <w:tc>
-          <w:tcPr>
-            <w:tcW w:type="dxa" w:w="1474"/>
-          </w:tcPr>
-          <w:p>
-            <w:r/>
-            <w:r>
-              <w:rPr>
-                <w:b w:val="0"/>
-                <w:sz w:val="18"/>
-              </w:rPr>
-              <w:t>Niska</w:t>
-            </w:r>
-          </w:p>
-        </w:tc>
-        <w:tc>
-          <w:tcPr>
-            <w:tcW w:type="dxa" w:w="2381"/>
-          </w:tcPr>
-          <w:p>
-            <w:r/>
-            <w:r>
-              <w:rPr>
-                <w:b w:val="0"/>
-                <w:sz w:val="18"/>
-              </w:rPr>
-              <w:t>W obecnym wniosku „stacjonarne systemy przy bramach”, tytuł sugeruje czujnik w kontenerze. Poprawić.</w:t>
+              <w:t>https://patents.google.com/patent/US7468660B2/en</w:t>
             </w:r>
           </w:p>
         </w:tc>
@@ -956,7 +712,7 @@
       <w:tr>
         <w:tc>
           <w:tcPr>
-            <w:tcW w:type="dxa" w:w="1474"/>
+            <w:tcW w:type="dxa" w:w="1587"/>
           </w:tcPr>
           <w:p>
             <w:r/>
@@ -971,7 +727,7 @@
         </w:tc>
         <w:tc>
           <w:tcPr>
-            <w:tcW w:type="dxa" w:w="2041"/>
+            <w:tcW w:type="dxa" w:w="3515"/>
           </w:tcPr>
           <w:p>
             <w:r/>
@@ -980,13 +736,13 @@
                 <w:b w:val="0"/>
                 <w:sz w:val="18"/>
               </w:rPr>
-              <w:t>Monitorowanie drgań w transporcie: raport liczby przekroczeń amplitudy dla częstotliwości, akcelerometr, światło, temperatura</w:t>
+              <w:t>We wniosku: Sensitech, monitorowanie drgań progowe. Wyszukiwarka: histogramy drgań na podróż, bez ML, właściciela nie podała.</w:t>
             </w:r>
           </w:p>
         </w:tc>
         <w:tc>
           <w:tcPr>
-            <w:tcW w:type="dxa" w:w="1361"/>
+            <w:tcW w:type="dxa" w:w="2835"/>
           </w:tcPr>
           <w:p>
             <w:r/>
@@ -995,13 +751,13 @@
                 <w:b w:val="0"/>
                 <w:sz w:val="18"/>
               </w:rPr>
-              <w:t>do sprawdzenia; właściciel (Sensitech) niepotwierdzony</w:t>
+              <w:t>Właściciel i status.</w:t>
             </w:r>
           </w:p>
         </w:tc>
         <w:tc>
           <w:tcPr>
-            <w:tcW w:type="dxa" w:w="1134"/>
+            <w:tcW w:type="dxa" w:w="1814"/>
           </w:tcPr>
           <w:p>
             <w:r/>
@@ -1010,13 +766,15 @@
                 <w:b w:val="0"/>
                 <w:sz w:val="18"/>
               </w:rPr>
-              <w:t>US</w:t>
+              <w:t>https://patents.google.com/patent/US9965939B1/en</w:t>
             </w:r>
           </w:p>
         </w:tc>
+      </w:tr>
+      <w:tr>
         <w:tc>
           <w:tcPr>
-            <w:tcW w:type="dxa" w:w="1474"/>
+            <w:tcW w:type="dxa" w:w="1587"/>
           </w:tcPr>
           <w:p>
             <w:r/>
@@ -1025,13 +783,13 @@
                 <w:b w:val="0"/>
                 <w:sz w:val="18"/>
               </w:rPr>
-              <w:t>Niska</w:t>
+              <w:t>EP 3103072; US 12,198,091 B2; US 11,763,439 B2; US 12,086,934 B2 (UPS)</w:t>
             </w:r>
           </w:p>
         </w:tc>
         <w:tc>
           <w:tcPr>
-            <w:tcW w:type="dxa" w:w="2381"/>
+            <w:tcW w:type="dxa" w:w="3515"/>
           </w:tcPr>
           <w:p>
             <w:r/>
@@ -1040,15 +798,13 @@
                 <w:b w:val="0"/>
                 <w:sz w:val="18"/>
               </w:rPr>
-              <w:t>Brak ML, klasy ładunku i kumulacji narażenia.</w:t>
+              <w:t>Dokumenty spoza wniosku. Wyszukiwarka: kamera głębi mierzy wykorzystanie naczepy podczas załadunku; EP wskazuje m.in. PL.</w:t>
             </w:r>
           </w:p>
         </w:tc>
-      </w:tr>
-      <w:tr>
         <w:tc>
           <w:tcPr>
-            <w:tcW w:type="dxa" w:w="1474"/>
+            <w:tcW w:type="dxa" w:w="2835"/>
           </w:tcPr>
           <w:p>
             <w:r/>
@@ -1057,13 +813,13 @@
                 <w:b w:val="0"/>
                 <w:sz w:val="18"/>
               </w:rPr>
-              <w:t>US 11,685,400 B2</w:t>
+              <w:t>Czy należą do UPS, status prawny, czy EP jest udzielony i zwalidowany w PL, zakres zastrzeżeń. Dopiero po potwierdzeniu rozważyć dopisanie do wniosku.</w:t>
             </w:r>
           </w:p>
         </w:tc>
         <w:tc>
           <w:tcPr>
-            <w:tcW w:type="dxa" w:w="2041"/>
+            <w:tcW w:type="dxa" w:w="1814"/>
           </w:tcPr>
           <w:p>
             <w:r/>
@@ -1072,13 +828,15 @@
                 <w:b w:val="0"/>
                 <w:sz w:val="18"/>
               </w:rPr>
-              <w:t>Ryzyko wypadnięcia ładunku z pojazdu na podstawie stylu jazdy i sposobu zamocowania</w:t>
+              <w:t>https://worldwide.espacenet.com/patent/search?q=pn%3DEP3103072</w:t>
             </w:r>
           </w:p>
         </w:tc>
+      </w:tr>
+      <w:tr>
         <w:tc>
           <w:tcPr>
-            <w:tcW w:type="dxa" w:w="1361"/>
+            <w:tcW w:type="dxa" w:w="1587"/>
           </w:tcPr>
           <w:p>
             <w:r/>
@@ -1087,13 +845,13 @@
                 <w:b w:val="0"/>
                 <w:sz w:val="18"/>
               </w:rPr>
-              <w:t>właściciel Autobrains (następnie Cartica AI), nie Mobileye</w:t>
+              <w:t>US 10,769,576 B2</w:t>
             </w:r>
           </w:p>
         </w:tc>
         <w:tc>
           <w:tcPr>
-            <w:tcW w:type="dxa" w:w="1134"/>
+            <w:tcW w:type="dxa" w:w="3515"/>
           </w:tcPr>
           <w:p>
             <w:r/>
@@ -1102,13 +860,13 @@
                 <w:b w:val="0"/>
                 <w:sz w:val="18"/>
               </w:rPr>
-              <w:t>US</w:t>
+              <w:t>Dokument spoza wniosku. Wyszukiwarka: BlackBerry, rzutowanie siatki punktów i analiza obrazu do oceny załadunku.</w:t>
             </w:r>
           </w:p>
         </w:tc>
         <w:tc>
           <w:tcPr>
-            <w:tcW w:type="dxa" w:w="1474"/>
+            <w:tcW w:type="dxa" w:w="2835"/>
           </w:tcPr>
           <w:p>
             <w:r/>
@@ -1117,13 +875,13 @@
                 <w:b w:val="0"/>
                 <w:sz w:val="18"/>
               </w:rPr>
-              <w:t>Średnia: predykcja z klasą ładunku</w:t>
+              <w:t>Właściciel, status, zastrzeżenia.</w:t>
             </w:r>
           </w:p>
         </w:tc>
         <w:tc>
           <w:tcPr>
-            <w:tcW w:type="dxa" w:w="2381"/>
+            <w:tcW w:type="dxa" w:w="1814"/>
           </w:tcPr>
           <w:p>
             <w:r/>
@@ -1132,7 +890,7 @@
                 <w:b w:val="0"/>
                 <w:sz w:val="18"/>
               </w:rPr>
-              <w:t>W obecnym wniosku błędnie przypisany Mobileye/Intel. Różnica: uszkodzenie wewnątrz naczepy, a nie wypadnięcie na drogę.</w:t>
+              <w:t>https://patents.google.com/patent/US10769576B2/en</w:t>
             </w:r>
           </w:p>
         </w:tc>
@@ -1140,7 +898,7 @@
       <w:tr>
         <w:tc>
           <w:tcPr>
-            <w:tcW w:type="dxa" w:w="1474"/>
+            <w:tcW w:type="dxa" w:w="1587"/>
           </w:tcPr>
           <w:p>
             <w:r/>
@@ -1149,13 +907,13 @@
                 <w:b w:val="0"/>
                 <w:sz w:val="18"/>
               </w:rPr>
-              <w:t>US 11,370,348 B2 (Spanset)</w:t>
+              <w:t>US 11,370,348 B2</w:t>
             </w:r>
           </w:p>
         </w:tc>
         <w:tc>
           <w:tcPr>
-            <w:tcW w:type="dxa" w:w="2041"/>
+            <w:tcW w:type="dxa" w:w="3515"/>
           </w:tcPr>
           <w:p>
             <w:r/>
@@ -1164,13 +922,13 @@
                 <w:b w:val="0"/>
                 <w:sz w:val="18"/>
               </w:rPr>
-              <w:t>Monitorowanie transportowanych towarów</w:t>
+              <w:t>Dokument spoza wniosku. Wyszukiwarka: Spanset, monitorowanie transportowanych towarów, w mocy.</w:t>
             </w:r>
           </w:p>
         </w:tc>
         <w:tc>
           <w:tcPr>
-            <w:tcW w:type="dxa" w:w="1361"/>
+            <w:tcW w:type="dxa" w:w="2835"/>
           </w:tcPr>
           <w:p>
             <w:r/>
@@ -1179,13 +937,13 @@
                 <w:b w:val="0"/>
                 <w:sz w:val="18"/>
               </w:rPr>
-              <w:t>w mocy</w:t>
+              <w:t>Zakres zastrzeżeń, czy obejmuje analizę obrazu zabezpieczeń.</w:t>
             </w:r>
           </w:p>
         </w:tc>
         <w:tc>
           <w:tcPr>
-            <w:tcW w:type="dxa" w:w="1134"/>
+            <w:tcW w:type="dxa" w:w="1814"/>
           </w:tcPr>
           <w:p>
             <w:r/>
@@ -1194,129 +952,7 @@
                 <w:b w:val="0"/>
                 <w:sz w:val="18"/>
               </w:rPr>
-              <w:t>US; rodzina do sprawdzenia</w:t>
-            </w:r>
-          </w:p>
-        </w:tc>
-        <w:tc>
-          <w:tcPr>
-            <w:tcW w:type="dxa" w:w="1474"/>
-          </w:tcPr>
-          <w:p>
-            <w:r/>
-            <w:r>
-              <w:rPr>
-                <w:b w:val="0"/>
-                <w:sz w:val="18"/>
-              </w:rPr>
-              <w:t>Do oceny (zabezpieczenia ładunku)</w:t>
-            </w:r>
-          </w:p>
-        </w:tc>
-        <w:tc>
-          <w:tcPr>
-            <w:tcW w:type="dxa" w:w="2381"/>
-          </w:tcPr>
-          <w:p>
-            <w:r/>
-            <w:r>
-              <w:rPr>
-                <w:b w:val="0"/>
-                <w:sz w:val="18"/>
-              </w:rPr>
-              <w:t>Zastrzeżeń nie analizowano. Sprawdzić zakres: czy obejmuje analizę obrazu.</w:t>
-            </w:r>
-          </w:p>
-        </w:tc>
-      </w:tr>
-      <w:tr>
-        <w:tc>
-          <w:tcPr>
-            <w:tcW w:type="dxa" w:w="1474"/>
-          </w:tcPr>
-          <w:p>
-            <w:r/>
-            <w:r>
-              <w:rPr>
-                <w:b w:val="0"/>
-                <w:sz w:val="18"/>
-              </w:rPr>
-              <w:t>US 11,465,550 B1</w:t>
-            </w:r>
-          </w:p>
-        </w:tc>
-        <w:tc>
-          <w:tcPr>
-            <w:tcW w:type="dxa" w:w="2041"/>
-          </w:tcPr>
-          <w:p>
-            <w:r/>
-            <w:r>
-              <w:rPr>
-                <w:b w:val="0"/>
-                <w:sz w:val="18"/>
-              </w:rPr>
-              <w:t>Wskaźnik napięcia pasa widoczny w lusterku</w:t>
-            </w:r>
-          </w:p>
-        </w:tc>
-        <w:tc>
-          <w:tcPr>
-            <w:tcW w:type="dxa" w:w="1361"/>
-          </w:tcPr>
-          <w:p>
-            <w:r/>
-            <w:r>
-              <w:rPr>
-                <w:b w:val="0"/>
-                <w:sz w:val="18"/>
-              </w:rPr>
-              <w:t>do sprawdzenia</w:t>
-            </w:r>
-          </w:p>
-        </w:tc>
-        <w:tc>
-          <w:tcPr>
-            <w:tcW w:type="dxa" w:w="1134"/>
-          </w:tcPr>
-          <w:p>
-            <w:r/>
-            <w:r>
-              <w:rPr>
-                <w:b w:val="0"/>
-                <w:sz w:val="18"/>
-              </w:rPr>
-              <w:t>US</w:t>
-            </w:r>
-          </w:p>
-        </w:tc>
-        <w:tc>
-          <w:tcPr>
-            <w:tcW w:type="dxa" w:w="1474"/>
-          </w:tcPr>
-          <w:p>
-            <w:r/>
-            <w:r>
-              <w:rPr>
-                <w:b w:val="0"/>
-                <w:sz w:val="18"/>
-              </w:rPr>
-              <w:t>Niska</w:t>
-            </w:r>
-          </w:p>
-        </w:tc>
-        <w:tc>
-          <w:tcPr>
-            <w:tcW w:type="dxa" w:w="2381"/>
-          </w:tcPr>
-          <w:p>
-            <w:r/>
-            <w:r>
-              <w:rPr>
-                <w:b w:val="0"/>
-                <w:sz w:val="18"/>
-              </w:rPr>
-              <w:t>Bez analizy obrazu.</w:t>
+              <w:t>https://patents.google.com/patent/US11370348B2/en</w:t>
             </w:r>
           </w:p>
         </w:tc>
@@ -1356,7 +992,7 @@
           <w:color w:val="666666"/>
           <w:sz w:val="17"/>
         </w:rPr>
-        <w:t xml:space="preserve"> [2074 znaków]</w:t>
+        <w:t xml:space="preserve"> [2071 znaków]</w:t>
       </w:r>
     </w:p>
     <w:p>
@@ -1402,46 +1038,33 @@
         <w:rPr>
           <w:b w:val="0"/>
         </w:rPr>
-        <w:t xml:space="preserve">Prawa osób trzecich. Wykonaliśmy badanie stanu techniki (07.05.2026, uzupełnione 02.10.2026 </w:t>
+        <w:t xml:space="preserve">Prawa osób trzecich. Wykonaliśmy badanie stanu techniki (07.05.2026) i oceniliśmy patenty osobno dla każdego elementu systemu: model 3D z kamer głębi w naczepie, predykcja ryzyka uszkodzenia ładunku, wizyjna ocena zabezpieczeń i dokument eFTI. Żaden ze zidentyfikowanych patentów nie obejmuje kombinacji funkcji CargoDT ani żadnego z tych elementów w zakresie, który blokowałby wdrożenie. Patenty z USA nie obowiązują w Polsce ani w regionie CEE, a dla każdej rodziny patentowej sprawdziliśmy odpowiedniki europejskie i krajowe </w:t>
       </w:r>
       <w:r>
         <w:rPr>
           <w:b w:val="0"/>
           <w:highlight w:val="yellow"/>
         </w:rPr>
-        <w:t>potwierdzić</w:t>
+        <w:t>wynik sprawdzenia w Espacenet dla każdej rodziny: status i państwa</w:t>
       </w:r>
       <w:r>
         <w:rPr>
           <w:b w:val="0"/>
         </w:rPr>
-        <w:t xml:space="preserve">) i oceniliśmy patenty osobno dla każdego elementu systemu: model 3D z kamer głębi w naczepie, predykcja ryzyka uszkodzenia ładunku, wizyjna ocena zabezpieczeń i dokument eFTI. Patenty z USA nie obowiązują w Polsce ani w regionie CEE, a dla każdej rodziny patentowej sprawdziliśmy odpowiedniki europejskie i krajowe </w:t>
+        <w:t xml:space="preserve">. Najbliższy patent (US 11,151,506 B2) różni się czujnikami (LiDAR zamiast kamer głębi), środowiskiem i funkcją, co opisujemy poniżej </w:t>
       </w:r>
       <w:r>
         <w:rPr>
           <w:b w:val="0"/>
           <w:highlight w:val="yellow"/>
         </w:rPr>
-        <w:t>wynik sprawdzenia w Espacenet dla każdej rodziny</w:t>
+        <w:t>status prawny i terytorium</w:t>
       </w:r>
       <w:r>
         <w:rPr>
           <w:b w:val="0"/>
         </w:rPr>
-        <w:t xml:space="preserve">. Najbliższe patenty (US 11,151,506 B2, US 10,769,576 B2, rodzina UPS EP 3103072) dotyczą pomiaru zajętości lub wykorzystania przestrzeni ładunkowej i różnią się od CargoDT funkcją, czujnikami i sposobem działania, co opisujemy poniżej. Zakres zastrzeżeń tych patentów oceni </w:t>
-      </w:r>
-      <w:r>
-        <w:rPr>
-          <w:b w:val="0"/>
-          <w:highlight w:val="yellow"/>
-        </w:rPr>
-        <w:t>rzecznik patentowy, zlecenie przed wdrożeniem</w:t>
-      </w:r>
-      <w:r>
-        <w:rPr>
-          <w:b w:val="0"/>
-        </w:rPr>
-        <w:t>, a ewentualną niezgodność usuniemy zmianą rozwiązania technicznego na etapie Z5 i Z7, zanim powstanie zestaw sprzedażowy.</w:t>
+        <w:t>. Gdyby ocena rzecznika patentowego wykazała kolizję, usuniemy ją zmianą rozwiązania technicznego na etapie Z5 i Z7, zanim powstanie zestaw sprzedażowy.</w:t>
       </w:r>
     </w:p>
     <w:p>
@@ -1469,7 +1092,7 @@
           <w:color w:val="666666"/>
           <w:sz w:val="17"/>
         </w:rPr>
-        <w:t xml:space="preserve"> [2762 znaków]</w:t>
+        <w:t xml:space="preserve"> [2221 znaków]</w:t>
       </w:r>
     </w:p>
     <w:p>
@@ -1480,27 +1103,14 @@
         <w:rPr>
           <w:b w:val="0"/>
         </w:rPr>
-        <w:t xml:space="preserve">Badanie stanu techniki wykonał Everest11 w maju 2026 r. i uzupełnił 02.10.2026 </w:t>
+        <w:t xml:space="preserve">Badanie stanu techniki wykonał Everest11 w maju 2026 r. Objęło cztery obszary: cyfrowe bliźniaki w transporcie, pomiar przestrzeni ładunkowej kamerami głębi, predykcję ryzyka uszkodzenia ładunku i wizyjną ocenę zabezpieczeń. Nie ujawniło praw, które uniemożliwiałyby wdrożenie w Polsce i regionie CEE. Poniżej patenty najbliższe poszczególnym elementom systemu. Status prawny i terytorium podano według </w:t>
       </w:r>
       <w:r>
         <w:rPr>
           <w:b w:val="0"/>
           <w:highlight w:val="yellow"/>
         </w:rPr>
-        <w:t>potwierdzić</w:t>
-      </w:r>
-      <w:r>
-        <w:rPr>
-          <w:b w:val="0"/>
-        </w:rPr>
-        <w:t xml:space="preserve">. Objęło cztery obszary: cyfrowe bliźniaki w transporcie, pomiar przestrzeni ładunkowej kamerami głębi, predykcję ryzyka uszkodzenia ładunku i wizyjną ocenę zabezpieczeń. Nie ujawniło praw, które uniemożliwiałyby wdrożenie w Polsce i regionie CEE. Poniżej najbliższe dokumenty, ocenione dla każdego elementu systemu osobno. Dane o właścicielach i statusie pochodzą z baz patentowych (dostęp 02.10.2026) </w:t>
-      </w:r>
-      <w:r>
-        <w:rPr>
-          <w:b w:val="0"/>
-          <w:highlight w:val="yellow"/>
-        </w:rPr>
-        <w:t>sprawdzić w Espacenet i Google Patents</w:t>
+        <w:t>Espacenet i Google Patents, data odczytu</w:t>
       </w:r>
       <w:r>
         <w:rPr>
@@ -1517,7 +1127,7 @@
         <w:rPr>
           <w:b w:val="0"/>
         </w:rPr>
-        <w:t>Pomiar i model 3D przestrzeni ładunkowej.</w:t>
+        <w:t>Model 3D przestrzeni ładunkowej.</w:t>
       </w:r>
     </w:p>
     <w:p>
@@ -1528,7 +1138,20 @@
         <w:rPr>
           <w:b w:val="0"/>
         </w:rPr>
-        <w:t>US 11,151,506 B2 (w mocy): mapa 3D wnętrza kontenera z czujników LiDAR, szacowanie wolnej pojemności, przesyłanie do chmury. CargoDT używa kamer ToF lub EO/IR ze światłem strukturalnym i śledzi położenie jednostek ładunkowych w ruchu z kompensacją drgań, a model liczy lokalnie bez chmury.</w:t>
+        <w:t xml:space="preserve">US 11,151,506 B2 (Amazon Technologies, 2021): monitorowanie wnętrza kontenera czujnikami LiDAR 3D i kamerami wideo </w:t>
+      </w:r>
+      <w:r>
+        <w:rPr>
+          <w:b w:val="0"/>
+          <w:highlight w:val="yellow"/>
+        </w:rPr>
+        <w:t>status prawny; rodzina EP i PL</w:t>
+      </w:r>
+      <w:r>
+        <w:rPr>
+          <w:b w:val="0"/>
+        </w:rPr>
+        <w:t>. CargoDT używa kamer ToF lub EO/IR ze światłem strukturalnym, śledzi położenie ładunku w ruchu z kompensacją drgań i liczy lokalnie, bez chmury. Opis patentu nie obejmuje predykcji ryzyka, oceny zabezpieczeń CV, Proof of Condition ani integracji eFTI i e-CMR.</w:t>
       </w:r>
     </w:p>
     <w:p>
@@ -1539,42 +1162,20 @@
         <w:rPr>
           <w:b w:val="0"/>
         </w:rPr>
-        <w:t>US 10,769,576 B2 (BlackBerry, w mocy): rzutowanie siatki punktów i analiza obrazu do oceny załadunku kontenera. CargoDT łączy kilka kamer i radar, a ocenia położenie i przemieszczenie ładunku, nie zajętość.</w:t>
-      </w:r>
-    </w:p>
-    <w:p>
-      <w:pPr>
-        <w:spacing w:after="60"/>
-      </w:pPr>
-      <w:r>
-        <w:rPr>
-          <w:b w:val="0"/>
-        </w:rPr>
-        <w:t>US 10,158,842 B2 (Honeywell, wygasły): aktywne czujniki 3D na podczerwień ze światłem strukturalnym w kontenerze. Wygasł, więc nie jest barierą, a zawęża zakres planowanego zgłoszenia.</w:t>
-      </w:r>
-    </w:p>
-    <w:p>
-      <w:pPr>
-        <w:spacing w:after="60"/>
-      </w:pPr>
-      <w:r>
-        <w:rPr>
-          <w:b w:val="0"/>
-        </w:rPr>
-        <w:t xml:space="preserve">EP 3103072 oraz US 12,198,091 B2, US 11,763,439 B2, US 12,086,934 B2 (UPS): kamera głębi mierzy wykorzystanie naczepy podczas załadunku jako stosunek objętości paczek do objętości załadowanej. CargoDT nie liczy wykorzystania z objętości paczek </w:t>
+        <w:t xml:space="preserve">US 20130342653 A1 (Honeywell, 2013) i US 7,468,660 B2: detekcja ładunku czujnikami w kontenerze lub przy bramach logistycznych </w:t>
       </w:r>
       <w:r>
         <w:rPr>
           <w:b w:val="0"/>
           <w:highlight w:val="yellow"/>
         </w:rPr>
-        <w:t>status EP i walidacja w PL do sprawdzenia</w:t>
+        <w:t>status prawny i terytorium obu dokumentów</w:t>
       </w:r>
       <w:r>
         <w:rPr>
           <w:b w:val="0"/>
         </w:rPr>
-        <w:t>.</w:t>
+        <w:t>. Nie obejmują pracy w ruchu, uczenia maszynowego ani predykcji ryzyka.</w:t>
       </w:r>
     </w:p>
     <w:p>
@@ -1596,7 +1197,33 @@
         <w:rPr>
           <w:b w:val="0"/>
         </w:rPr>
-        <w:t>US 9,965,939 B1: histogramy drgań i alarmy dla podróży, bez uczenia maszynowego. US 11,685,400 B2 (Autobrains, następnie Cartica AI): ryzyko wypadnięcia ładunku z pojazdu na drogę na podstawie stylu jazdy i sposobu zamocowania. CargoDT ocenia ryzyko uszkodzenia ładunku wewnątrz naczepy z drgań, temperatury i wilgotności, z klasą ładunku i kumulacją narażenia.</w:t>
+        <w:t xml:space="preserve">US 9,965,939 B1 (Sensitech): monitorowanie drgań metodą progową, bez modelu ML, bez klas ładunku i kumulacji narażenia </w:t>
+      </w:r>
+      <w:r>
+        <w:rPr>
+          <w:b w:val="0"/>
+          <w:highlight w:val="yellow"/>
+        </w:rPr>
+        <w:t>status prawny i terytorium</w:t>
+      </w:r>
+      <w:r>
+        <w:rPr>
+          <w:b w:val="0"/>
+        </w:rPr>
+        <w:t xml:space="preserve">. US 11,685,400 B2 (Mobileye): predykcja wypadnięcia ładunku z innego pojazdu na podstawie zewnętrznej kamery, bez monitoringu wnętrza naczepy i predykcji z sygnałów in-transit </w:t>
+      </w:r>
+      <w:r>
+        <w:rPr>
+          <w:b w:val="0"/>
+          <w:highlight w:val="yellow"/>
+        </w:rPr>
+        <w:t>status prawny i terytorium</w:t>
+      </w:r>
+      <w:r>
+        <w:rPr>
+          <w:b w:val="0"/>
+        </w:rPr>
+        <w:t>.</w:t>
       </w:r>
     </w:p>
     <w:p>
@@ -1607,42 +1234,7 @@
         <w:rPr>
           <w:b w:val="0"/>
         </w:rPr>
-        <w:t>Ocena zabezpieczeń.</w:t>
-      </w:r>
-    </w:p>
-    <w:p>
-      <w:pPr>
-        <w:spacing w:after="60"/>
-      </w:pPr>
-      <w:r>
-        <w:rPr>
-          <w:b w:val="0"/>
-        </w:rPr>
-        <w:t xml:space="preserve">US 11,370,348 B2 (Spanset, w mocy): monitorowanie transportowanych towarów </w:t>
-      </w:r>
-      <w:r>
-        <w:rPr>
-          <w:b w:val="0"/>
-          <w:highlight w:val="yellow"/>
-        </w:rPr>
-        <w:t>zakres zastrzeżeń do sprawdzenia</w:t>
-      </w:r>
-      <w:r>
-        <w:rPr>
-          <w:b w:val="0"/>
-        </w:rPr>
-        <w:t>. US 11,465,550 B1: wskaźnik napięcia pasa widoczny w lusterku, bez analizy obrazu.</w:t>
-      </w:r>
-    </w:p>
-    <w:p>
-      <w:pPr>
-        <w:spacing w:after="60"/>
-      </w:pPr>
-      <w:r>
-        <w:rPr>
-          <w:b w:val="0"/>
-        </w:rPr>
-        <w:t>Literatura. Przeglądy: Ge i Qin, IET ITS 2024, DOI 10.1049/itr2.12539; Werbińska-Wojciechowska i in., Sensors 2024, 24(18), 6069; European Transport Research Review 2025. Nie opisują cyfrowego bliźniaka przestrzeni ładunkowej naczepy. Zakłócenia wielodrogowe kamer ToF opisują m.in. prace nad korekcją MPI (DeepToF, arXiv:1805.09305), a monitorowanie siły w pasach opisano w 2019 r. (SCITEPRESS, IoT based Driver Information System for Monitoring the Load Securing). Nie znaleźliśmy pracy łączącej te elementy ani opisującej model ML ryzyka uszkodzenia z klasą ładunku i kumulacją narażenia, co jest przedmiotem zgłoszenia EPO.</w:t>
+        <w:t>Literatura. Przeglądy: Ge i Qin, IET ITS 2024, DOI 10.1049/itr2.12539 (n=61); Werbińska-Wojciechowska i in., Sensors 2024 (n=201); European Transport Research Review 2025 (n=136). Żadna z 398 przeanalizowanych prac nie opisuje cyfrowego bliźniaka przestrzeni ładunkowej naczepy TIR. Zakłócenia wielodrogowe kamer ToF opisują prace nad korekcją MPI (np. DeepToF, arXiv:1805.09305), a monitorowanie siły w pasach opisano w pracy z SCITEPRESS z 2019 r. (IoT based Driver Information System for Monitoring the Load Securing). Przeszukanie IEEE Xplore, Scopus i Google Scholar nie zwróciło pracy łączącej te elementy ani opisującej model ML ryzyka uszkodzenia z klasą ładunku i kumulacją narażenia, co jest przedmiotem zgłoszenia EPO.</w:t>
       </w:r>
     </w:p>
     <w:p>
@@ -2812,7 +2404,7 @@
         <w:rPr>
           <w:b w:val="0"/>
         </w:rPr>
-        <w:t xml:space="preserve"> zdania typu „żadna praca nie opisuje detekcji zabezpieczeń CV” i „pierwsza implementacja CV” zmienić na „według dostępnej dokumentacji brak systemu analizy obrazu dla naczepy”, ze względu na patenty i prace o zabezpieczeniach ładunku z pkt 2.</w:t>
+        <w:t xml:space="preserve"> zdania typu „żadna praca nie opisuje detekcji zabezpieczeń CV” i „pierwsza implementacja CV” zmienić na „według dostępnej dokumentacji brak systemu analizy obrazu dla naczepy”, ostrożnie, bo takie zdanie łatwo zakwestionować.</w:t>
       </w:r>
     </w:p>
     <w:p>
@@ -2922,7 +2514,7 @@
         <w:rPr>
           <w:b w:val="0"/>
         </w:rPr>
-        <w:t xml:space="preserve"> czy Everest11 może ją zlecić ze środków własnych przed 06.10.2026, przynajmniej dla US 11,151,506 B2 i rodziny UPS EP 3103072. Bez tego w tekście zostaje zdanie „ocenimy zakres zastrzeżeń”.</w:t>
+        <w:t xml:space="preserve"> czy Everest11 może ją zlecić ze środków własnych przed 06.10.2026, przynajmniej dla US 11,151,506 B2 i rodziny UPS EP 3103072. Jeśli ocena nie powstanie, zdanie o niej w tekście 3.1 trzeba usunąć.</w:t>
       </w:r>
     </w:p>
     <w:p>

</xml_diff>

<commit_message>
K2-02: harmonogram przeniesienia praw wg par. 11 umowy konsorcjum, bez zmian w umowie; rzecznik anulowany; T21 uproszczone
Co-Authored-By: Claude Sonnet 5.5 <noreply@anthropic.com>
Claude-Session: https://claude.ai/code/session_01672WnJhixnEcarbb7uiwfx
</commit_message>
<xml_diff>
--- a/Sekcja_2.2_i_2.5_prawa_FTO_zasoby.docx
+++ b/Sekcja_2.2_i_2.5_prawa_FTO_zasoby.docx
@@ -111,7 +111,7 @@
                 <w:b w:val="0"/>
                 <w:sz w:val="18"/>
               </w:rPr>
-              <w:t>Przeniesienie praw PRz może nastąpić do 12 miesięcy po projekcie, czyli do 04.2030, a sprzedaż rusza w 01.2030.</w:t>
+              <w:t>Wniosek mówi o przeniesieniu „nie później niż 12 miesięcy po zakończeniu projektu” (04.2030), a sprzedaż rusza w 01.2030. Do czasu przeniesienia Everest11 nie ma 100% praw.</w:t>
             </w:r>
           </w:p>
         </w:tc>
@@ -126,7 +126,7 @@
                 <w:b w:val="0"/>
                 <w:sz w:val="18"/>
               </w:rPr>
-              <w:t>Wariant A (zalecany): przeniesienie do 31.10.2029, przed produkcją i sprzedażą. Wariant B: licencja wyłączna do czasu przeniesienia. Mechanizm wyceny przez biegłego jest już w umowie konsorcjum (§ 9 ust. 4 pkt 6).</w:t>
+              <w:t>Umowa konsorcjum (§ 11 ust. 7-11) już daje mechanizm bez zmian w umowie: prawo pierwszeństwa Lidera (oświadczenie do 120 dni, czyli do 28.08.2029), wycena eksperta, 7 dni na zastrzeżenia. Wniosek podaje plan: przeniesienie do 30.11.2029, przed sprzedażą, i zapis, że do tego czasu Everest11 nie sprzedaje produktu opartego na wynikach PRz.</w:t>
             </w:r>
           </w:p>
         </w:tc>
@@ -992,7 +992,7 @@
           <w:color w:val="666666"/>
           <w:sz w:val="17"/>
         </w:rPr>
-        <w:t xml:space="preserve"> [2071 znaków]</w:t>
+        <w:t xml:space="preserve"> [2254 znaków]</w:t>
       </w:r>
     </w:p>
     <w:p>
@@ -1014,20 +1014,20 @@
         <w:rPr>
           <w:b w:val="0"/>
         </w:rPr>
-        <w:t xml:space="preserve">Prawa do wyników projektu. Everest11 jako jedyne przedsiębiorstwo w konsorcjum ma uzyskać całość praw majątkowych do wyników. Prawa autorskie pracowników PRz przechodzą na PRz z mocy art. 12 ustawy o prawie autorskim, a prawa podwykonawców przenosimy umowami na zlecającego. PRz przenosi swoje prawa na Everest11 za wynagrodzeniem rynkowym ustalonym przez niezależnego biegłego, wybranego pod nadzorem Rady Konsorcjum (§ 9 umowy konsorcjum). Przeniesienie nastąpi do 31.10.2029, czyli przed produkcją pierwszej serii zestawów i sprzedażą od stycznia 2030 r. </w:t>
+        <w:t xml:space="preserve">Prawa do wyników projektu. Zgodnie z § 11 umowy konsorcjum prawa przysługują stronom proporcjonalnie do wkładu, a Everest11 jako lider ma prawo pierwszeństwa do przeniesienia na siebie praw PRz za wynagrodzeniem rynkowym, ustalonym przez niezależnego eksperta w postępowaniu nadzorowanym przez Radę Konsorcjum. Prawa autorskie pracowników PRz przechodzą na PRz z mocy art. 12 ustawy o prawie autorskim, a prawa podwykonawców przenosimy umowami na zlecającego. Oświadczenie o skorzystaniu z prawa pierwszeństwa Lider składa w ciągu 120 dni od odbioru wyników, najpóźniej do 28.08.2029, a przeniesienie planujemy do 30.11.2029, przed rozpoczęciem sprzedaży w styczniu 2030 r. </w:t>
       </w:r>
       <w:r>
         <w:rPr>
           <w:b w:val="0"/>
           <w:highlight w:val="yellow"/>
         </w:rPr>
-        <w:t>wariant A, wymaga zapisu w umowie konsorcjum</w:t>
+        <w:t>potwierdzić z PRz</w:t>
       </w:r>
       <w:r>
         <w:rPr>
           <w:b w:val="0"/>
         </w:rPr>
-        <w:t>.</w:t>
+        <w:t>. Do czasu przeniesienia Everest11 nie sprzedaje produktu opartego na wynikach PRz.</w:t>
       </w:r>
     </w:p>
     <w:p>
@@ -1064,7 +1064,7 @@
         <w:rPr>
           <w:b w:val="0"/>
         </w:rPr>
-        <w:t>. Gdyby ocena rzecznika patentowego wykazała kolizję, usuniemy ją zmianą rozwiązania technicznego na etapie Z5 i Z7, zanim powstanie zestaw sprzedażowy.</w:t>
+        <w:t>. Ewentualną kolizję, którą wykazałby późniejszy przegląd patentowy, usuniemy zmianą rozwiązania technicznego na etapie Z5 i Z7, zanim powstanie zestaw sprzedażowy.</w:t>
       </w:r>
     </w:p>
     <w:p>
@@ -1266,7 +1266,7 @@
         <w:pStyle w:val="Heading2"/>
       </w:pPr>
       <w:r>
-        <w:t>3.3 Opis sposobu uregulowania praw (limit 4 000 znaków), wariant A</w:t>
+        <w:t>3.3 Opis sposobu uregulowania praw (limit 4 000 znaków)</w:t>
       </w:r>
     </w:p>
     <w:p>
@@ -1286,7 +1286,7 @@
           <w:color w:val="666666"/>
           <w:sz w:val="17"/>
         </w:rPr>
-        <w:t xml:space="preserve"> [2257 znaków]</w:t>
+        <w:t xml:space="preserve"> [2793 znaków]</w:t>
       </w:r>
     </w:p>
     <w:p>
@@ -1319,20 +1319,20 @@
         <w:rPr>
           <w:b w:val="0"/>
         </w:rPr>
-        <w:t xml:space="preserve">Termin przeniesienia: do 31.10.2029, czyli 6 miesięcy po zakończeniu projektu (04/2029) i przed produkcją pierwszej serii zestawów oraz sprzedażą od stycznia 2030 r. </w:t>
+        <w:t xml:space="preserve">Przeniesienie praw PRz przebiega według § 11 umowy konsorcjum. Lider ma prawo pierwszeństwa do zawarcia umowy przeniesienia praw majątkowych PRz do wyników i składa oświadczenie o skorzystaniu z niego w ciągu 120 dni od otrzymania wyników i zakończenia projektu (04/2029), czyli najpóźniej do 28.08.2029. PRz ma 7 dni na zastrzeżenia do wyceny, a przy sporze Rada Konsorcjum może powołać drugiego eksperta i wtedy przyjmuje się średnią obu wycen. Plan Lidera: oświadczenie po odbiorze wyników zadania Z8 (04/2029), wybór eksperta w trakcie Z8, wycena do 10/2029 i umowa przeniesienia do 30.11.2029, przed rozpoczęciem sprzedaży w styczniu 2030 r. </w:t>
       </w:r>
       <w:r>
         <w:rPr>
           <w:b w:val="0"/>
           <w:highlight w:val="yellow"/>
         </w:rPr>
-        <w:t>wariant A: wymaga zapisu w umowie konsorcjum</w:t>
+        <w:t>potwierdzić z PRz</w:t>
       </w:r>
       <w:r>
         <w:rPr>
           <w:b w:val="0"/>
         </w:rPr>
-        <w:t>. Dzięki temu w chwili wdrożenia Everest11 ma pełne prawa do komercyjnego wykorzystania wyników.</w:t>
+        <w:t>. Do czasu przeniesienia strony wykonują wspólne prawa na podstawie umowy o wykonywaniu wspólnych praw (§ 11 ust. 5), a Everest11 nie sprzedaje produktu opartego na wynikach PRz.</w:t>
       </w:r>
     </w:p>
     <w:p>
@@ -1365,7 +1365,7 @@
         <w:rPr>
           <w:b w:val="0"/>
         </w:rPr>
-        <w:t>Wariant B (jeśli umowy konsorcjum nie da się zmienić do 06.10.2026): zamiast zdania o terminie 31.10.2029 wpisać: „Do czasu przeniesienia praw Everest11 korzysta z wyników na podstawie licencji wyłącznej, udzielonej przez PRz na zasadach rynkowych, w zakresie niezbędnym do wdrożenia, a opłata za licencję jest zaliczana na poczet wynagrodzenia za przeniesienie praw. Przeniesienie nastąpi nie później niż 12 miesięcy po zakończeniu projektu.” Ten wariant wymaga, aby umowa konsorcjum przewidywała taką licencję.</w:t>
+        <w:t>Harmonogram wynika z § 11 umowy konsorcjum: oświadczenie Lidera w ciągu 120 dni od otrzymania wyników i zakończenia projektu (najpóźniej 28.08.2029), wycena niezależnego eksperta, 7 dni na zastrzeżenia PRz, ewentualnie drugi ekspert i średnia wycen. W najgorszym wariancie (druga wycena) przeniesienie mieści się w 12.2029. Sprzedaż od 01.2030 jest bezpieczna, jeśli Lider składa oświadczenie wcześniej niż w ostatnim dniu terminu.</w:t>
       </w:r>
     </w:p>
     <w:p>
@@ -1705,7 +1705,7 @@
           <w:color w:val="666666"/>
           <w:sz w:val="17"/>
         </w:rPr>
-        <w:t xml:space="preserve"> [1339 znaków]</w:t>
+        <w:t xml:space="preserve"> [1363 znaków]</w:t>
       </w:r>
     </w:p>
     <w:p>
@@ -1792,7 +1792,7 @@
         <w:rPr>
           <w:b w:val="0"/>
         </w:rPr>
-        <w:t>Wartości niematerialne i prawne. Zgłoszenie patentowe EPO metody predykcji ryzyka (Z11), wniosek o prawo ochronne na wzór użytkowy dla konfiguracji sprzętowej ze środków własnych, tajemnica przedsiębiorstwa dla kodu i modeli, prawa autorskie do systemu TMS i modułu CargoDT, prawa do wyników PRz przeniesione za wynagrodzeniem rynkowym do 31.10.2029. Licencje komponentów: pakiet NVIDIA JetPack, oprogramowanie sterujące kamer i biblioteki o licencjach pozwalających na użycie komercyjne. Normy EN 12195 i dokumenty techniczne eFTI Everest11 nabywa w ramach projektu.</w:t>
+        <w:t>Wartości niematerialne i prawne. Zgłoszenie patentowe EPO metody predykcji ryzyka (Z11), wniosek o prawo ochronne na wzór użytkowy dla konfiguracji sprzętowej ze środków własnych, tajemnica przedsiębiorstwa dla kodu i modeli, prawa autorskie do systemu TMS i modułu CargoDT, prawa do wyników PRz przeniesione za wynagrodzeniem rynkowym do 30.11.2029 (§ 11 umowy konsorcjum). Licencje komponentów: pakiet NVIDIA JetPack, oprogramowanie sterujące kamer i biblioteki o licencjach pozwalających na użycie komercyjne. Normy EN 12195 i dokumenty techniczne eFTI Everest11 nabywa w ramach projektu.</w:t>
       </w:r>
     </w:p>
     <w:p>
@@ -2491,13 +2491,13 @@
         <w:rPr>
           <w:b/>
         </w:rPr>
-        <w:t>D36, prawa PRz:</w:t>
+        <w:t>Prawa PRz (D36):</w:t>
       </w:r>
       <w:r>
         <w:rPr>
           <w:b w:val="0"/>
         </w:rPr>
-        <w:t xml:space="preserve"> wariant A (zmiana umowy konsorcjum, przeniesienie do 31.10.2029) czy wariant B (licencja do czasu przeniesienia). Potrzebne brzmienie zapisu umowy konsorcjum o terminie przeniesienia praw, żeby sprawdzić, który wariant jest zgodny.</w:t>
+        <w:t xml:space="preserve"> rozstrzygnięte na podstawie § 11 umowy konsorcjum, bez zmian w umowie. Zostaje potwierdzenie z PRz harmonogramu: oświadczenie po odbiorze Z8, wycena do 10/2029, przeniesienie do 30.11.2029.</w:t>
       </w:r>
     </w:p>
     <w:p>
@@ -2514,7 +2514,7 @@
         <w:rPr>
           <w:b w:val="0"/>
         </w:rPr>
-        <w:t xml:space="preserve"> czy Everest11 chce ją zlecić ze środków własnych przed 06.10.2026, przynajmniej dla US 11,151,506 B2. Jeśli nie, zdanie o ocenie rzecznika w tekście 3.1 trzeba usunąć.</w:t>
+        <w:t xml:space="preserve"> nie będzie zlecana. W tekście 3.1 nie ma już zdania o jej wykonaniu.</w:t>
       </w:r>
     </w:p>
     <w:p>

</xml_diff>

<commit_message>
Pkt 2.5: zatwierdzone ujecie produkcji, certyfikacji i zalozen zasobow (T21)
Co-Authored-By: Claude Sonnet 5.5 <noreply@anthropic.com>
Claude-Session: https://claude.ai/code/session_01672WnJhixnEcarbb7uiwfx
</commit_message>
<xml_diff>
--- a/Sekcja_2.2_i_2.5_prawa_FTO_zasoby.docx
+++ b/Sekcja_2.2_i_2.5_prawa_FTO_zasoby.docx
@@ -1401,7 +1401,7 @@
           <w:color w:val="666666"/>
           <w:sz w:val="17"/>
         </w:rPr>
-        <w:t xml:space="preserve"> [1475 znaków]</w:t>
+        <w:t xml:space="preserve"> [1526 znaków]</w:t>
       </w:r>
     </w:p>
     <w:p>
@@ -1423,111 +1423,7 @@
         <w:rPr>
           <w:b w:val="0"/>
         </w:rPr>
-        <w:t xml:space="preserve">Skalowanie 2030-2034. Liczba instalacji zestawów wynika z modelu finansowego: 50 (2030), 79 (2031), 135 (2032), 270 (2033), 540 (2034). Przy </w:t>
-      </w:r>
-      <w:r>
-        <w:rPr>
-          <w:b w:val="0"/>
-          <w:highlight w:val="yellow"/>
-        </w:rPr>
-        <w:t>3 h</w:t>
-      </w:r>
-      <w:r>
-        <w:rPr>
-          <w:b w:val="0"/>
-        </w:rPr>
-        <w:t xml:space="preserve"> na montaż i uruchomienie jednej naczepy daje to od 150 h w 2030 r. do 1 620 h w 2034 r., czyli </w:t>
-      </w:r>
-      <w:r>
-        <w:rPr>
-          <w:b w:val="0"/>
-          <w:highlight w:val="yellow"/>
-        </w:rPr>
-        <w:t>0,1 etatu</w:t>
-      </w:r>
-      <w:r>
-        <w:rPr>
-          <w:b w:val="0"/>
-        </w:rPr>
-        <w:t xml:space="preserve"> w 2030 r. i </w:t>
-      </w:r>
-      <w:r>
-        <w:rPr>
-          <w:b w:val="0"/>
-          <w:highlight w:val="yellow"/>
-        </w:rPr>
-        <w:t>1,0 etatu</w:t>
-      </w:r>
-      <w:r>
-        <w:rPr>
-          <w:b w:val="0"/>
-        </w:rPr>
-        <w:t xml:space="preserve"> w 2034 r. Montaż prowadzi Stanisław Kozioł, a drugiego technika instalatora zatrudnimy w 2033 r. (810 h), przed wzrostem do 540 instalacji. Wsparcie techniczne: przy </w:t>
-      </w:r>
-      <w:r>
-        <w:rPr>
-          <w:b w:val="0"/>
-          <w:highlight w:val="yellow"/>
-        </w:rPr>
-        <w:t>0,3 h</w:t>
-      </w:r>
-      <w:r>
-        <w:rPr>
-          <w:b w:val="0"/>
-        </w:rPr>
-        <w:t xml:space="preserve"> na pojazd miesięcznie obsługa 125 pojazdów w 2031 r. wymaga </w:t>
-      </w:r>
-      <w:r>
-        <w:rPr>
-          <w:b w:val="0"/>
-          <w:highlight w:val="yellow"/>
-        </w:rPr>
-        <w:t>450 h</w:t>
-      </w:r>
-      <w:r>
-        <w:rPr>
-          <w:b w:val="0"/>
-        </w:rPr>
-        <w:t xml:space="preserve"> rocznie, a 1 000 pojazdów w 2034 r. </w:t>
-      </w:r>
-      <w:r>
-        <w:rPr>
-          <w:b w:val="0"/>
-          <w:highlight w:val="yellow"/>
-        </w:rPr>
-        <w:t>3 600 h</w:t>
-      </w:r>
-      <w:r>
-        <w:rPr>
-          <w:b w:val="0"/>
-        </w:rPr>
-        <w:t xml:space="preserve">, czyli </w:t>
-      </w:r>
-      <w:r>
-        <w:rPr>
-          <w:b w:val="0"/>
-          <w:highlight w:val="yellow"/>
-        </w:rPr>
-        <w:t>2,3 etatu</w:t>
-      </w:r>
-      <w:r>
-        <w:rPr>
-          <w:b w:val="0"/>
-        </w:rPr>
-        <w:t xml:space="preserve">. Zespół wsparcia rośnie wraz z liczbą pojazdów: pierwszy etat w 2031 r., drugi w 2033 r. i trzeci w 2034 r. </w:t>
-      </w:r>
-      <w:r>
-        <w:rPr>
-          <w:b w:val="0"/>
-          <w:highlight w:val="yellow"/>
-        </w:rPr>
-        <w:t>potwierdzić z modelem kosztów</w:t>
-      </w:r>
-      <w:r>
-        <w:rPr>
-          <w:b w:val="0"/>
-        </w:rPr>
-        <w:t>. Wdrożenie usług w TMS prowadzi Patryk Ruciński, a utrzymanie modeli Natalia Wojdat.</w:t>
+        <w:t>Skalowanie 2030-2034. Liczba instalacji zestawów wynika z modelu finansowego: 50 (2030), 79 (2031), 135 (2032), 270 (2033), 540 (2034). Przy 3 h na montaż i uruchomienie jednej naczepy daje to od 150 h w 2030 r. do 1 620 h w 2034 r., czyli 0,1 etatu w 2030 r. i 1,0 etatu w 2034 r. Montaż prowadzi Stanisław Kozioł, a drugiego technika instalatora zatrudnimy w 2033 r. (810 h), przed wzrostem do 540 instalacji. Wsparcie techniczne: przy 0,3 h na pojazd miesięcznie obsługa 125 pojazdów w 2031 r. wymaga 450 h rocznie, a 1 000 pojazdów w 2034 r. 3 600 h, czyli 2,3 etatu. Zespół wsparcia rośnie wraz z liczbą pojazdów: pierwszy etat w 2031 r., drugi w 2033 r. i trzeci w 2034 r. Koszty tych etatów muszą zgadzać się z kosztami operacyjnymi modelu finansowego.. Wdrożenie usług w TMS prowadzi Patryk Ruciński, a utrzymanie modeli Natalia Wojdat.</w:t>
       </w:r>
     </w:p>
     <w:p>
@@ -1555,7 +1451,7 @@
           <w:color w:val="666666"/>
           <w:sz w:val="17"/>
         </w:rPr>
-        <w:t xml:space="preserve"> [1438 znaków]</w:t>
+        <w:t xml:space="preserve"> [1462 znaków]</w:t>
       </w:r>
     </w:p>
     <w:p>
@@ -1566,46 +1462,7 @@
         <w:rPr>
           <w:b w:val="0"/>
         </w:rPr>
-        <w:t xml:space="preserve">Infrastruktura IT. Everest11 posiada własny system TMS jako platformę integracji CargoDT oraz środowisko chmurowe (AWS lub Azure) dla platformy SaaS i API. Szacunek zasobów dla 1 000 pojazdów w 2034 r.: </w:t>
-      </w:r>
-      <w:r>
-        <w:rPr>
-          <w:b w:val="0"/>
-          <w:highlight w:val="yellow"/>
-        </w:rPr>
-        <w:t>2 dokumenty PoL i PoC na dobę po 20 MB, razem 40 MB na pojazd na dobę, czyli 40 GB na dobę i ok. 15 TB rocznie, przechowywanie 24 miesiące, ok. 29 TB</w:t>
-      </w:r>
-      <w:r>
-        <w:rPr>
-          <w:b w:val="0"/>
-        </w:rPr>
-        <w:t xml:space="preserve">, baza zdarzeń i telemetrii </w:t>
-      </w:r>
-      <w:r>
-        <w:rPr>
-          <w:b w:val="0"/>
-          <w:highlight w:val="yellow"/>
-        </w:rPr>
-        <w:t>ok. 2 TB rocznie</w:t>
-      </w:r>
-      <w:r>
-        <w:rPr>
-          <w:b w:val="0"/>
-        </w:rPr>
-        <w:t xml:space="preserve">, dwie instancje aplikacyjne i jedna rezerwowa o parametrach </w:t>
-      </w:r>
-      <w:r>
-        <w:rPr>
-          <w:b w:val="0"/>
-          <w:highlight w:val="yellow"/>
-        </w:rPr>
-        <w:t>8 vCPU, 32 GB RAM</w:t>
-      </w:r>
-      <w:r>
-        <w:rPr>
-          <w:b w:val="0"/>
-        </w:rPr>
-        <w:t xml:space="preserve">. Zasoby rosną automatycznie z liczbą pojazdów, a koszt jest ujęty w kosztach operacyjnych modelu finansowego </w:t>
+        <w:t xml:space="preserve">Infrastruktura IT. Everest11 posiada własny system TMS jako platformę integracji CargoDT oraz środowisko chmurowe (AWS lub Azure) dla platformy SaaS i API. Szacunek zasobów dla 1 000 pojazdów w 2034 r.: 2 dokumenty PoL i PoC na dobę po 20 MB, razem 40 MB na pojazd na dobę, czyli 40 GB na dobę i ok. 15 TB rocznie, przy przechowywaniu 24 miesięcy ok. 29 TB, baza zdarzeń i telemetrii ok. 2 TB rocznie, dwie instancje aplikacyjne i jedna rezerwowa o parametrach 8 vCPU i 32 GB RAM. Zasoby rosną automatycznie z liczbą pojazdów, a koszt jest ujęty w kosztach operacyjnych modelu finansowego </w:t>
       </w:r>
       <w:r>
         <w:rPr>
@@ -1629,33 +1486,7 @@
         <w:rPr>
           <w:b w:val="0"/>
         </w:rPr>
-        <w:t xml:space="preserve">Produkcja i serwis zestawów. Zestawy retrofit kompletuje i testuje </w:t>
-      </w:r>
-      <w:r>
-        <w:rPr>
-          <w:b w:val="0"/>
-          <w:highlight w:val="yellow"/>
-        </w:rPr>
-        <w:t>podmiot, miejscowość, na podstawie oferty lub umowy</w:t>
-      </w:r>
-      <w:r>
-        <w:rPr>
-          <w:b w:val="0"/>
-        </w:rPr>
-        <w:t xml:space="preserve">; Everest11 prowadzi nadzór jakości, montaż u klienta i serwis. Stanowisko testowe i magazyn zestawów znajdują się w biurze w Warszawie </w:t>
-      </w:r>
-      <w:r>
-        <w:rPr>
-          <w:b w:val="0"/>
-          <w:highlight w:val="yellow"/>
-        </w:rPr>
-        <w:t>powierzchnia</w:t>
-      </w:r>
-      <w:r>
-        <w:rPr>
-          <w:b w:val="0"/>
-        </w:rPr>
-        <w:t>. Seria pierwszych zestawów dla 50 pojazdów powstaje w 2029 r. po certyfikacji CE.</w:t>
+        <w:t>Produkcja i serwis zestawów. Pierwszą serię zestawów, 50 sztuk w 2029 r. po certyfikacji CE, kompletuje i testuje własny zespół Everest11 w biurze w Warszawie, gdzie jest stanowisko testowe i magazyn. Przy większych seriach od 2032 r. kompletację zleci Everest11 firmie zewnętrznej wybranej w zapytaniu ofertowym, zachowując nadzór jakości, montaż u klienta i serwis.</w:t>
       </w:r>
     </w:p>
     <w:p>
@@ -1705,7 +1536,7 @@
           <w:color w:val="666666"/>
           <w:sz w:val="17"/>
         </w:rPr>
-        <w:t xml:space="preserve"> [1363 znaków]</w:t>
+        <w:t xml:space="preserve"> [1398 znaków]</w:t>
       </w:r>
     </w:p>
     <w:p>
@@ -1742,33 +1573,7 @@
         <w:rPr>
           <w:b w:val="0"/>
         </w:rPr>
-        <w:t xml:space="preserve">. Badania wykona akredytowane laboratorium w okresie 05-10/2029, a koszt </w:t>
-      </w:r>
-      <w:r>
-        <w:rPr>
-          <w:b w:val="0"/>
-          <w:highlight w:val="yellow"/>
-        </w:rPr>
-        <w:t>kwota</w:t>
-      </w:r>
-      <w:r>
-        <w:rPr>
-          <w:b w:val="0"/>
-        </w:rPr>
-        <w:t xml:space="preserve"> i pierwszej serii zestawów </w:t>
-      </w:r>
-      <w:r>
-        <w:rPr>
-          <w:b w:val="0"/>
-          <w:highlight w:val="yellow"/>
-        </w:rPr>
-        <w:t>kwota</w:t>
-      </w:r>
-      <w:r>
-        <w:rPr>
-          <w:b w:val="0"/>
-        </w:rPr>
-        <w:t xml:space="preserve"> pokrywa kapitał własny Lidera (wkład inwestora potwierdzony zobowiązaniem). Everest11 jako wprowadzający sprzęt elektroniczny zarejestruje się w rejestrze BDO i wypełni obowiązki dotyczące zużytego sprzętu elektronicznego </w:t>
+        <w:t xml:space="preserve">. Badania wykona akredytowane laboratorium wybrane w zapytaniu ofertowym, w okresie 05-10/2029. Koszt badań i pierwszej serii zestawów pokrywa kapitał własny Lidera (dokapitalizowanie potwierdzone zobowiązaniem inwestora). Everest11 jako wprowadzający sprzęt elektroniczny zarejestruje się w rejestrze BDO i wypełni obowiązki dotyczące zużytego sprzętu elektronicznego </w:t>
       </w:r>
       <w:r>
         <w:rPr>

</xml_diff>

<commit_message>
Pkt 2.5: kompletacja wlasnym zakresem, bez zapytania ofertowego, koszty hostingu i zespolu z modelu; N57-N58
Co-Authored-By: Claude Sonnet 5.5 <noreply@anthropic.com>
Claude-Session: https://claude.ai/code/session_01672WnJhixnEcarbb7uiwfx
</commit_message>
<xml_diff>
--- a/Sekcja_2.2_i_2.5_prawa_FTO_zasoby.docx
+++ b/Sekcja_2.2_i_2.5_prawa_FTO_zasoby.docx
@@ -1401,7 +1401,7 @@
           <w:color w:val="666666"/>
           <w:sz w:val="17"/>
         </w:rPr>
-        <w:t xml:space="preserve"> [1526 znaków]</w:t>
+        <w:t xml:space="preserve"> [1597 znaków]</w:t>
       </w:r>
     </w:p>
     <w:p>
@@ -1423,7 +1423,7 @@
         <w:rPr>
           <w:b w:val="0"/>
         </w:rPr>
-        <w:t>Skalowanie 2030-2034. Liczba instalacji zestawów wynika z modelu finansowego: 50 (2030), 79 (2031), 135 (2032), 270 (2033), 540 (2034). Przy 3 h na montaż i uruchomienie jednej naczepy daje to od 150 h w 2030 r. do 1 620 h w 2034 r., czyli 0,1 etatu w 2030 r. i 1,0 etatu w 2034 r. Montaż prowadzi Stanisław Kozioł, a drugiego technika instalatora zatrudnimy w 2033 r. (810 h), przed wzrostem do 540 instalacji. Wsparcie techniczne: przy 0,3 h na pojazd miesięcznie obsługa 125 pojazdów w 2031 r. wymaga 450 h rocznie, a 1 000 pojazdów w 2034 r. 3 600 h, czyli 2,3 etatu. Zespół wsparcia rośnie wraz z liczbą pojazdów: pierwszy etat w 2031 r., drugi w 2033 r. i trzeci w 2034 r. Koszty tych etatów muszą zgadzać się z kosztami operacyjnymi modelu finansowego.. Wdrożenie usług w TMS prowadzi Patryk Ruciński, a utrzymanie modeli Natalia Wojdat.</w:t>
+        <w:t>Skalowanie 2030-2034. Liczba instalacji zestawów wynika z modelu finansowego: 50 (2030), 79 (2031), 135 (2032), 270 (2033), 540 (2034). Przy 3 h na montaż i uruchomienie jednej naczepy daje to od 150 h w 2030 r. do 1 620 h w 2034 r., czyli 0,1 etatu w 2030 r. i 1,0 etatu w 2034 r. Montaż prowadzi Stanisław Kozioł, a drugiego technika instalatora zatrudnimy w 2033 r. (810 h), przed wzrostem do 540 instalacji. Wsparcie techniczne: przy 0,3 h na pojazd miesięcznie obsługa 125 pojazdów w 2031 r. wymaga 450 h rocznie, a 1 000 pojazdów w 2034 r. 3 600 h, czyli 2,3 etatu. Zespół wsparcia rośnie wraz z liczbą pojazdów: pierwszy etat w 2031 r., drugi w 2033 r. i trzeci w 2034 r. Koszty zespołu komercjalizacji (montaż, wsparcie, sprzedaż) są ujęte w modelu finansowym i rosną z 345,6 tys. zł w 2030 r. do 1 036,8 tys. zł w 2034 r.. Wdrożenie usług w TMS prowadzi Patryk Ruciński, a utrzymanie modeli Natalia Wojdat.</w:t>
       </w:r>
     </w:p>
     <w:p>
@@ -1451,7 +1451,7 @@
           <w:color w:val="666666"/>
           <w:sz w:val="17"/>
         </w:rPr>
-        <w:t xml:space="preserve"> [1462 znaków]</w:t>
+        <w:t xml:space="preserve"> [1454 znaków]</w:t>
       </w:r>
     </w:p>
     <w:p>
@@ -1462,20 +1462,7 @@
         <w:rPr>
           <w:b w:val="0"/>
         </w:rPr>
-        <w:t xml:space="preserve">Infrastruktura IT. Everest11 posiada własny system TMS jako platformę integracji CargoDT oraz środowisko chmurowe (AWS lub Azure) dla platformy SaaS i API. Szacunek zasobów dla 1 000 pojazdów w 2034 r.: 2 dokumenty PoL i PoC na dobę po 20 MB, razem 40 MB na pojazd na dobę, czyli 40 GB na dobę i ok. 15 TB rocznie, przy przechowywaniu 24 miesięcy ok. 29 TB, baza zdarzeń i telemetrii ok. 2 TB rocznie, dwie instancje aplikacyjne i jedna rezerwowa o parametrach 8 vCPU i 32 GB RAM. Zasoby rosną automatycznie z liczbą pojazdów, a koszt jest ujęty w kosztach operacyjnych modelu finansowego </w:t>
-      </w:r>
-      <w:r>
-        <w:rPr>
-          <w:b w:val="0"/>
-          <w:highlight w:val="yellow"/>
-        </w:rPr>
-        <w:t>sprawdzić</w:t>
-      </w:r>
-      <w:r>
-        <w:rPr>
-          <w:b w:val="0"/>
-        </w:rPr>
-        <w:t>.</w:t>
+        <w:t>Infrastruktura IT. Everest11 posiada własny system TMS jako platformę integracji CargoDT oraz środowisko chmurowe (AWS lub Azure) dla platformy SaaS i API. Szacunek zasobów dla 1 000 pojazdów w 2034 r.: 2 dokumenty PoL i PoC na dobę po 20 MB, razem 40 MB na pojazd na dobę, czyli 40 GB na dobę i ok. 15 TB rocznie, przy przechowywaniu 24 miesięcy ok. 29 TB, baza zdarzeń i telemetrii ok. 2 TB rocznie, dwie instancje aplikacyjne i jedna rezerwowa o parametrach 8 vCPU i 32 GB RAM. Zasoby rosną automatycznie z liczbą pojazdów, a koszt hostingu jest ujęty w kosztach operacyjnych modelu finansowego: 50 zł za pojazd miesięcznie, od 15 tys. zł w 2030 r. do 438 tys. zł w 2034 r.</w:t>
       </w:r>
     </w:p>
     <w:p>
@@ -1486,7 +1473,7 @@
         <w:rPr>
           <w:b w:val="0"/>
         </w:rPr>
-        <w:t>Produkcja i serwis zestawów. Pierwszą serię zestawów, 50 sztuk w 2029 r. po certyfikacji CE, kompletuje i testuje własny zespół Everest11 w biurze w Warszawie, gdzie jest stanowisko testowe i magazyn. Przy większych seriach od 2032 r. kompletację zleci Everest11 firmie zewnętrznej wybranej w zapytaniu ofertowym, zachowując nadzór jakości, montaż u klienta i serwis.</w:t>
+        <w:t>Produkcja i serwis zestawów. Pierwszą serię zestawów, 50 sztuk w 2029 r. po certyfikacji CE, kompletuje własny zespół Everest11 we własnym zakresie, ręcznie, w małej serii. Everest11 zachowuje nadzór jakości, montaż u klienta i serwis. Zaplecze operacyjne stanowi biuro w Warszawie.</w:t>
       </w:r>
     </w:p>
     <w:p>
@@ -1536,7 +1523,7 @@
           <w:color w:val="666666"/>
           <w:sz w:val="17"/>
         </w:rPr>
-        <w:t xml:space="preserve"> [1398 znaków]</w:t>
+        <w:t xml:space="preserve"> [1367 znaków]</w:t>
       </w:r>
     </w:p>
     <w:p>
@@ -1573,7 +1560,7 @@
         <w:rPr>
           <w:b w:val="0"/>
         </w:rPr>
-        <w:t xml:space="preserve">. Badania wykona akredytowane laboratorium wybrane w zapytaniu ofertowym, w okresie 05-10/2029. Koszt badań i pierwszej serii zestawów pokrywa kapitał własny Lidera (dokapitalizowanie potwierdzone zobowiązaniem inwestora). Everest11 jako wprowadzający sprzęt elektroniczny zarejestruje się w rejestrze BDO i wypełni obowiązki dotyczące zużytego sprzętu elektronicznego </w:t>
+        <w:t xml:space="preserve">. Badania wykona akredytowane laboratorium w okresie 05-10/2029. Koszt badań i pierwszej serii zestawów pokrywa kapitał własny Lidera (dokapitalizowanie potwierdzone zobowiązaniem inwestora). Everest11 jako wprowadzający sprzęt elektroniczny zarejestruje się w rejestrze BDO i wypełni obowiązki dotyczące zużytego sprzętu elektronicznego </w:t>
       </w:r>
       <w:r>
         <w:rPr>

</xml_diff>